<commit_message>
Fix mislabelled directionality in report Figure 5 caption
Report incorrectly stated 'higher = worse' for TI CPI and WB CCE — both
measures have higher = cleaner (less corrupt). The figure itself was
correctly labelled; only the report text and caption were wrong. Also
corrected 'three sources' to 'two' (fig17 shows TI + WB only, not V-Dem).

https://claude.ai/code/session_01VPyoR41GyDEmsGVPwTUhQE
</commit_message>
<xml_diff>
--- a/israel_analysis_output/Israel_Populism_Report.docx
+++ b/israel_analysis_output/Israel_Populism_Report.docx
@@ -636,7 +636,7 @@
           <w:i w:val="0"/>
           <w:sz w:val="22"/>
         </w:rPr>
-        <w:t>Figure 5 overlays three normalised corruption indicators (TI CPI, World Bank CCE, and V-Dem Executive Corruption), standardised to a common 0–1 scale where higher values indicate worse perceived corruption. All three sources agree on the direction:</w:t>
+        <w:t>Figure 5 overlays two independent, corruption-specific indicators (TI CPI and World Bank Control of Corruption), normalised to a common 0–1 scale where higher values indicate better governance (less corruption). For both measures, a declining trend means worsening corruption. Both sources agree on the direction:</w:t>
       </w:r>
     </w:p>
     <w:p>
@@ -737,7 +737,7 @@
           <w:color w:val="555555"/>
           <w:sz w:val="18"/>
         </w:rPr>
-        <w:t>Figure 5 — Normalised corruption indicators from three independent sources (higher = worse). Shaded bands indicate periods of right-bloc government.</w:t>
+        <w:t>Figure 5 — TI CPI and World Bank Control of Corruption, normalised 0–1 (higher = cleaner / less corrupt). Declining lines indicate worsening governance. Shaded bands = right-wing governments.</w:t>
       </w:r>
     </w:p>
     <w:p>

</xml_diff>